<commit_message>
docs: refresh report screenshots and Loki guidance
</commit_message>
<xml_diff>
--- a/Bao_cao_De_3_WordPress.docx
+++ b/Bao_cao_De_3_WordPress.docx
@@ -1224,12 +1224,11 @@
         <w:ind w:firstLine="0"/>
       </w:pPr>
       <w:r>
-        <w:t>Hình 3.1: Ảnh chụp tệp nginx/default.conf trên GitHub</w:t>
-      </w:r>
-      <w:r>
+        <w:t>Hình 3.1: Nginx default.conf trên GitHub, phần chuyển tiếp /pma/ và / tới các dịch vụ tương ứng.</w:t>
         <w:tab/>
         <w:t>7</w:t>
       </w:r>
+      <w:r/>
     </w:p>
     <w:p>
       <w:pPr>
@@ -1240,12 +1239,11 @@
         <w:ind w:firstLine="0"/>
       </w:pPr>
       <w:r>
-        <w:t>Hình 4.1: Dashboard runtime WordPress Stack Overview</w:t>
-      </w:r>
-      <w:r>
+        <w:t>Hình 4.1: Dashboard WordPress Stack Overview sau cập nhật cAdvisor; cả bốn panel hiển thị dữ liệu, ba panel tài nguyên có chuỗi cho 11 container.</w:t>
         <w:tab/>
         <w:t>10</w:t>
       </w:r>
+      <w:r/>
     </w:p>
     <w:p>
       <w:pPr>
@@ -1272,12 +1270,11 @@
         <w:ind w:firstLine="0"/>
       </w:pPr>
       <w:r>
-        <w:t>Hình 4.3: Kết quả truy vấn log Nginx trên Loki</w:t>
-      </w:r>
-      <w:r>
+        <w:t>Hình 4.3: Loki Explore với {job="docker",container="wp_nginx"}; khoảng Last 24 hours có một bản ghi access HTTP 200.</w:t>
         <w:tab/>
         <w:t>11</w:t>
       </w:r>
+      <w:r/>
     </w:p>
     <w:p>
       <w:pPr>
@@ -2563,7 +2560,7 @@
                     <pic:cNvPicPr/>
                   </pic:nvPicPr>
                   <pic:blipFill>
-                    <a:blip r:embed="rId12"/>
+                    <a:blip r:embed="rId23"/>
                     <a:stretch>
                       <a:fillRect/>
                     </a:stretch>
@@ -3566,7 +3563,7 @@
                     <pic:cNvPicPr/>
                   </pic:nvPicPr>
                   <pic:blipFill>
-                    <a:blip r:embed="rId15"/>
+                    <a:blip r:embed="rId24"/>
                     <a:stretch>
                       <a:fillRect/>
                     </a:stretch>
@@ -3600,7 +3597,7 @@
           <w:i/>
           <w:sz w:val="18"/>
         </w:rPr>
-        <w:t>Hình 3.1: Ảnh chụp tệp nginx/default.conf trên GitHub.</w:t>
+        <w:t>Hình 3.1: Nginx default.conf trên GitHub, phần chuyển tiếp /pma/ và / tới các dịch vụ tương ứng.</w:t>
       </w:r>
     </w:p>
     <w:p>
@@ -4390,7 +4387,7 @@
         <w:spacing w:after="120"/>
       </w:pPr>
       <w:r>
-        <w:t>Kiểm tra runtime ngày 24/10/2026: docker compose config --quiet hoàn tất; Grafana health API trả HTTP 200, database=ok, phiên bản 10.0.0; cAdvisor v0.60.6 ở trạng thái healthy. Truy vấn Prometheus up cho thấy cả bốn target (prometheus, cadvisor, mysql, nginx) đều có giá trị 1. Các biểu thức CPU, bộ nhớ và mạng trên dashboard mỗi biểu thức trả về 11 chuỗi dữ liệu có nhãn container; nginx_connections_active có giá trị 1 tại thời điểm truy vấn. Truy vấn Loki {job="docker",container="wp_app"} trả log WordPress; {job="nginx_access"} truy vấn log Nginx. Hình 4.1 ghi lại dashboard trước khi cập nhật cAdvisor, nên trạng thái No data trong ảnh không phản ánh lần kiểm tra hiện tại. HTTP localhost trả 301 sang HTTPS; môi trường chưa tin cậy chứng chỉ self-signed nên chưa xác nhận nội dung WordPress/phpMyAdmin qua HTTPS.</w:t>
+        <w:t>Kiểm tra runtime ngày 24/10/2026: docker compose config --quiet hoàn tất; Grafana health API trả HTTP 200, database=ok, phiên bản 10.0.0; cAdvisor v0.60.6 healthy. Truy vấn up trả giá trị 1 cho cả bốn target. Ba biểu thức tài nguyên trên dashboard trả 11 series theo container; nginx_connections_active có giá trị 1 tại thời điểm kiểm tra. Dashboard hiện hiển thị dữ liệu ở cả bốn panel sau khi cập nhật cAdvisor. Loki Explore với {job="docker",container="wp_nginx"} trả log access HTTP 200; xem chi tiết ở mục 4.2. HTTP localhost trả 301 sang HTTPS; chứng chỉ self-signed chưa được môi trường tin cậy nên nội dung WordPress/phpMyAdmin chưa được xác minh qua trình duyệt.</w:t>
       </w:r>
     </w:p>
     <w:p>
@@ -4420,7 +4417,7 @@
                     <pic:cNvPicPr/>
                   </pic:nvPicPr>
                   <pic:blipFill>
-                    <a:blip r:embed="rId16"/>
+                    <a:blip r:embed="rId25"/>
                     <a:stretch>
                       <a:fillRect/>
                     </a:stretch>
@@ -4454,7 +4451,7 @@
           <w:i/>
           <w:sz w:val="18"/>
         </w:rPr>
-        <w:t>Hình 4.1: Dashboard trước cập nhật cAdvisor; ba panel CPU, bộ nhớ và mạng chưa có dữ liệu.</w:t>
+        <w:t>Hình 4.1: Dashboard WordPress Stack Overview sau cập nhật cAdvisor; cả bốn panel hiển thị dữ liệu, ba panel tài nguyên có chuỗi cho 11 container.</w:t>
       </w:r>
     </w:p>
     <w:p>
@@ -4483,7 +4480,7 @@
                     <pic:cNvPicPr/>
                   </pic:nvPicPr>
                   <pic:blipFill>
-                    <a:blip r:embed="rId17"/>
+                    <a:blip r:embed="rId26"/>
                     <a:stretch>
                       <a:fillRect/>
                     </a:stretch>
@@ -4545,7 +4542,7 @@
         <w:spacing w:after="120"/>
       </w:pPr>
       <w:r>
-        <w:t>Promtail phát hiện container qua docker_sd_configs và Docker socket, đồng thời đọc tệp Nginx access log. Log Docker mang nhãn job=docker cùng container và stream; log Nginx mang nhãn job=nginx_access. Cấu hình gắn nhãn job=docker để truy vấn toàn bộ log container bằng {job="docker"}; có thể lọc WordPress bằng {container="wp_app"}. Grafana dùng datasource Loki để truy vấn trên monitoring-net.</w:t>
+        <w:t>Promtail phát hiện container qua Docker socket và đọc Nginx access log. Docker logs có nhãn job=docker, container, stream; Nginx logs dùng job=nginx_access. Trong Grafana Explore, {job="docker"} tìm log trên mọi container; thêm container="wp_nginx" để lọc. Trong Last 24 hours, selector này trả một log access HTTP 200 (Hình 4.3). Nếu No data, tăng khoảng thời gian để bao gồm timestamp của log.</w:t>
       </w:r>
     </w:p>
     <w:p>
@@ -4629,7 +4626,7 @@
           </w:p>
           <w:p>
             <w:r>
-              <w:t>{container="wp_app"} |= "error"</w:t>
+              <w:t>{job="docker",container="wp_nginx"}</w:t>
             </w:r>
           </w:p>
           <w:p>
@@ -4684,7 +4681,7 @@
                     <pic:cNvPicPr/>
                   </pic:nvPicPr>
                   <pic:blipFill>
-                    <a:blip r:embed="rId18"/>
+                    <a:blip r:embed="rId27"/>
                     <a:stretch>
                       <a:fillRect/>
                     </a:stretch>
@@ -4718,7 +4715,7 @@
           <w:i/>
           <w:sz w:val="18"/>
         </w:rPr>
-        <w:t>Hình 4.3: Ví dụ truy vấn access log Nginx trên Loki bằng nhãn job=nginx_access.</w:t>
+        <w:t>Hình 4.3: Loki Explore với {job="docker",container="wp_nginx"}; khoảng Last 24 hours có một bản ghi access HTTP 200.</w:t>
       </w:r>
     </w:p>
     <w:p>
@@ -5144,7 +5141,7 @@
           </w:tcPr>
           <w:p>
             <w:r>
-              <w:t>Ba panel CPU/bộ nhớ/mạng trả dữ liệu cho 11 container; Nginx active connections có dữ liệu. Loki trả log WordPress với {job="docker",container="wp_app"} và log Nginx với {job="nginx_access"}.</w:t>
+              <w:t>Ba panel tài nguyên hiển thị 11 container. Loki với {job="docker",container="wp_nginx"} trong 24 giờ trả một log HTTP 200.</w:t>
             </w:r>
           </w:p>
         </w:tc>
@@ -5176,7 +5173,7 @@
         <w:spacing w:after="120"/>
       </w:pPr>
       <w:r>
-        <w:t>Dự án tổ chức website Nem Xứ Thanh trên WordPress, MySQL và Docker Compose; Nginx chuyển tiếp request, còn Prometheus/Grafana và Loki/Promtail hỗ trợ quan sát. Kiểm tra runtime xác nhận Compose hợp lệ, Grafana health API khỏe, cả bốn Prometheus target UP, ba panel CPU/bộ nhớ/mạng có dữ liệu cho 11 container và Loki truy vấn được log Docker bằng {job="docker"}. Prometheus UI được publish tại http://localhost:9090 trên loopback. HTTPS vẫn dùng chứng chỉ self-signed nên cần thay bằng chứng chỉ được tin cậy trước khi triển khai thực tế.</w:t>
+        <w:t>Dự án tổ chức website Nem Xứ Thanh trên WordPress, MySQL và Docker Compose; Nginx chuyển tiếp request, còn Prometheus/Grafana và Loki/Promtail hỗ trợ quan sát. Kiểm tra runtime xác nhận Compose hợp lệ, Grafana health API khỏe, cả bốn Prometheus target UP, dashboard có dữ liệu cho 11 container và truy vấn Loki {job="docker",container="wp_nginx"} trả log HTTP 200 trong khoảng Last 24 hours. Prometheus UI được publish tại http://localhost:9090 trên loopback. HTTPS vẫn dùng chứng chỉ self-signed nên cần thay bằng chứng chỉ được tin cậy trước khi triển khai thực tế.</w:t>
       </w:r>
     </w:p>
     <w:p>

</xml_diff>